<commit_message>
Add initial styles and structure for Bug Report Management application
- Created a new CSS file for styling with basic styles for body, page title, tables, and footer.
- Added header and footer partials in EJS for consistent layout across pages.
- Introduced a new EJS view for displaying reports.
</commit_message>
<xml_diff>
--- a/Assignment2/Screenshot_Ass2.docx
+++ b/Assignment2/Screenshot_Ass2.docx
@@ -313,7 +313,13 @@
     </w:p>
     <w:p>
       <w:pPr>
-        <w:jc w:val="center"/>
+        <w:rPr>
+          <w:rFonts w:asciiTheme="majorHAnsi" w:hAnsiTheme="majorHAnsi" w:cstheme="majorHAnsi"/>
+          <w:sz w:val="26"/>
+          <w:szCs w:val="26"/>
+        </w:rPr>
+      </w:pPr>
+      <w:r>
         <w:rPr>
           <w:rFonts w:asciiTheme="majorHAnsi" w:hAnsiTheme="majorHAnsi" w:cstheme="majorHAnsi"/>
           <w:i/>
@@ -322,6 +328,201 @@
           <w:szCs w:val="20"/>
           <w:lang w:val="en-US"/>
         </w:rPr>
+        <w:drawing>
+          <wp:inline distT="0" distB="0" distL="0" distR="0" wp14:anchorId="733F1CDD" wp14:editId="296E77B4">
+            <wp:extent cx="6210300" cy="2249805"/>
+            <wp:effectExtent l="0" t="0" r="0" b="0"/>
+            <wp:docPr id="1" name="Picture 1"/>
+            <wp:cNvGraphicFramePr>
+              <a:graphicFrameLocks xmlns:a="http://schemas.openxmlformats.org/drawingml/2006/main" noChangeAspect="1"/>
+            </wp:cNvGraphicFramePr>
+            <a:graphic xmlns:a="http://schemas.openxmlformats.org/drawingml/2006/main">
+              <a:graphicData uri="http://schemas.openxmlformats.org/drawingml/2006/picture">
+                <pic:pic xmlns:pic="http://schemas.openxmlformats.org/drawingml/2006/picture">
+                  <pic:nvPicPr>
+                    <pic:cNvPr id="1" name=""/>
+                    <pic:cNvPicPr/>
+                  </pic:nvPicPr>
+                  <pic:blipFill>
+                    <a:blip r:embed="rId7"/>
+                    <a:stretch>
+                      <a:fillRect/>
+                    </a:stretch>
+                  </pic:blipFill>
+                  <pic:spPr>
+                    <a:xfrm>
+                      <a:off x="0" y="0"/>
+                      <a:ext cx="6210300" cy="2249805"/>
+                    </a:xfrm>
+                    <a:prstGeom prst="rect">
+                      <a:avLst/>
+                    </a:prstGeom>
+                  </pic:spPr>
+                </pic:pic>
+              </a:graphicData>
+            </a:graphic>
+          </wp:inline>
+        </w:drawing>
+      </w:r>
+    </w:p>
+    <w:p>
+      <w:pPr>
+        <w:rPr>
+          <w:rFonts w:asciiTheme="majorHAnsi" w:hAnsiTheme="majorHAnsi" w:cstheme="majorHAnsi"/>
+          <w:sz w:val="26"/>
+          <w:szCs w:val="26"/>
+        </w:rPr>
+      </w:pPr>
+    </w:p>
+    <w:p>
+      <w:pPr>
+        <w:rPr>
+          <w:rFonts w:asciiTheme="majorHAnsi" w:hAnsiTheme="majorHAnsi" w:cstheme="majorHAnsi"/>
+          <w:sz w:val="26"/>
+          <w:szCs w:val="26"/>
+          <w:lang w:val="en-US"/>
+        </w:rPr>
+      </w:pPr>
+      <w:r>
+        <w:rPr>
+          <w:rFonts w:asciiTheme="majorHAnsi" w:hAnsiTheme="majorHAnsi" w:cstheme="majorHAnsi"/>
+          <w:b/>
+          <w:color w:val="000000"/>
+          <w:sz w:val="26"/>
+          <w:szCs w:val="26"/>
+        </w:rPr>
+        <w:t>Screenshot</w:t>
+      </w:r>
+      <w:r>
+        <w:rPr>
+          <w:rFonts w:asciiTheme="majorHAnsi" w:hAnsiTheme="majorHAnsi" w:cstheme="majorHAnsi"/>
+          <w:b/>
+          <w:sz w:val="26"/>
+          <w:szCs w:val="26"/>
+        </w:rPr>
+        <w:t xml:space="preserve"> </w:t>
+      </w:r>
+      <w:r>
+        <w:rPr>
+          <w:rFonts w:asciiTheme="majorHAnsi" w:hAnsiTheme="majorHAnsi" w:cstheme="majorHAnsi"/>
+          <w:b/>
+          <w:sz w:val="26"/>
+          <w:szCs w:val="26"/>
+          <w:lang w:val="en-US"/>
+        </w:rPr>
+        <w:t>2</w:t>
+      </w:r>
+      <w:r>
+        <w:rPr>
+          <w:rFonts w:asciiTheme="majorHAnsi" w:hAnsiTheme="majorHAnsi" w:cstheme="majorHAnsi"/>
+          <w:b/>
+          <w:sz w:val="26"/>
+          <w:szCs w:val="26"/>
+          <w:lang w:val="en-US"/>
+        </w:rPr>
+        <w:t>:</w:t>
+      </w:r>
+      <w:r>
+        <w:rPr>
+          <w:rFonts w:asciiTheme="majorHAnsi" w:hAnsiTheme="majorHAnsi" w:cstheme="majorHAnsi"/>
+          <w:sz w:val="26"/>
+          <w:szCs w:val="26"/>
+        </w:rPr>
+        <w:t xml:space="preserve"> </w:t>
+      </w:r>
+      <w:r>
+        <w:rPr>
+          <w:rFonts w:asciiTheme="majorHAnsi" w:hAnsiTheme="majorHAnsi" w:cstheme="majorHAnsi"/>
+          <w:color w:val="000000"/>
+          <w:sz w:val="26"/>
+          <w:szCs w:val="26"/>
+        </w:rPr>
+        <w:t xml:space="preserve">Screenshot of MongoDB Compass with database </w:t>
+      </w:r>
+      <w:r>
+        <w:rPr>
+          <w:rFonts w:asciiTheme="majorHAnsi" w:hAnsiTheme="majorHAnsi" w:cstheme="majorHAnsi"/>
+          <w:color w:val="0070C0"/>
+          <w:sz w:val="26"/>
+          <w:szCs w:val="26"/>
+        </w:rPr>
+        <w:t>bug_reports</w:t>
+      </w:r>
+      <w:r>
+        <w:rPr>
+          <w:rFonts w:asciiTheme="majorHAnsi" w:hAnsiTheme="majorHAnsi" w:cstheme="majorHAnsi"/>
+          <w:color w:val="0070C0"/>
+          <w:sz w:val="26"/>
+          <w:szCs w:val="26"/>
+          <w:lang w:val="en-US"/>
+        </w:rPr>
+        <w:t xml:space="preserve"> </w:t>
+      </w:r>
+      <w:r>
+        <w:rPr>
+          <w:rFonts w:asciiTheme="majorHAnsi" w:hAnsiTheme="majorHAnsi" w:cstheme="majorHAnsi"/>
+          <w:sz w:val="26"/>
+          <w:szCs w:val="26"/>
+          <w:lang w:val="en-US"/>
+        </w:rPr>
+        <w:t xml:space="preserve">(has a collection of </w:t>
+      </w:r>
+      <w:r>
+        <w:rPr>
+          <w:rFonts w:asciiTheme="majorHAnsi" w:hAnsiTheme="majorHAnsi" w:cstheme="majorHAnsi"/>
+          <w:color w:val="0070C0"/>
+          <w:sz w:val="26"/>
+          <w:szCs w:val="26"/>
+          <w:lang w:val="en-US"/>
+        </w:rPr>
+        <w:t xml:space="preserve">reports </w:t>
+      </w:r>
+      <w:r>
+        <w:rPr>
+          <w:rFonts w:asciiTheme="majorHAnsi" w:hAnsiTheme="majorHAnsi" w:cstheme="majorHAnsi"/>
+          <w:sz w:val="26"/>
+          <w:szCs w:val="26"/>
+          <w:lang w:val="en-US"/>
+        </w:rPr>
+        <w:t xml:space="preserve">and </w:t>
+      </w:r>
+      <w:r>
+        <w:rPr>
+          <w:rFonts w:asciiTheme="majorHAnsi" w:hAnsiTheme="majorHAnsi" w:cstheme="majorHAnsi"/>
+          <w:color w:val="0070C0"/>
+          <w:sz w:val="26"/>
+          <w:szCs w:val="26"/>
+          <w:lang w:val="en-US"/>
+        </w:rPr>
+        <w:t>users</w:t>
+      </w:r>
+      <w:r>
+        <w:rPr>
+          <w:rFonts w:asciiTheme="majorHAnsi" w:hAnsiTheme="majorHAnsi" w:cstheme="majorHAnsi"/>
+          <w:sz w:val="26"/>
+          <w:szCs w:val="26"/>
+          <w:lang w:val="en-US"/>
+        </w:rPr>
+        <w:t>.)</w:t>
+      </w:r>
+    </w:p>
+    <w:p>
+      <w:pPr>
+        <w:rPr>
+          <w:rFonts w:asciiTheme="majorHAnsi" w:hAnsiTheme="majorHAnsi" w:cstheme="majorHAnsi"/>
+          <w:sz w:val="26"/>
+          <w:szCs w:val="26"/>
+        </w:rPr>
+      </w:pPr>
+    </w:p>
+    <w:p>
+      <w:pPr>
+        <w:rPr>
+          <w:rFonts w:asciiTheme="majorHAnsi" w:eastAsia="MS Mincho" w:hAnsiTheme="majorHAnsi" w:cstheme="majorHAnsi" w:hint="eastAsia"/>
+          <w:sz w:val="26"/>
+          <w:szCs w:val="26"/>
+          <w:lang w:eastAsia="ja-JP"/>
+        </w:rPr>
       </w:pPr>
       <w:r>
         <w:rPr>
@@ -332,213 +533,42 @@
           <w:szCs w:val="20"/>
           <w:lang w:val="en-US"/>
         </w:rPr>
-        <w:t>&lt;P</w:t>
-      </w:r>
-      <w:bookmarkStart w:id="0" w:name="_GoBack"/>
-      <w:bookmarkEnd w:id="0"/>
-      <w:r>
-        <w:rPr>
-          <w:rFonts w:asciiTheme="majorHAnsi" w:hAnsiTheme="majorHAnsi" w:cstheme="majorHAnsi"/>
-          <w:i/>
-          <w:color w:val="00B050"/>
-          <w:sz w:val="20"/>
-          <w:szCs w:val="20"/>
-          <w:lang w:val="en-US"/>
-        </w:rPr>
-        <w:t>lace the image here&gt;</w:t>
-      </w:r>
-    </w:p>
-    <w:p>
-      <w:pPr>
-        <w:rPr>
-          <w:rFonts w:asciiTheme="majorHAnsi" w:hAnsiTheme="majorHAnsi" w:cstheme="majorHAnsi"/>
-          <w:sz w:val="26"/>
-          <w:szCs w:val="26"/>
-        </w:rPr>
-      </w:pPr>
-    </w:p>
-    <w:p>
-      <w:pPr>
-        <w:rPr>
-          <w:rFonts w:asciiTheme="majorHAnsi" w:hAnsiTheme="majorHAnsi" w:cstheme="majorHAnsi"/>
-          <w:sz w:val="26"/>
-          <w:szCs w:val="26"/>
-        </w:rPr>
-      </w:pPr>
-    </w:p>
-    <w:p>
-      <w:pPr>
-        <w:rPr>
-          <w:rFonts w:asciiTheme="majorHAnsi" w:hAnsiTheme="majorHAnsi" w:cstheme="majorHAnsi"/>
-          <w:sz w:val="26"/>
-          <w:szCs w:val="26"/>
-          <w:lang w:val="en-US"/>
-        </w:rPr>
-      </w:pPr>
-      <w:r>
-        <w:rPr>
-          <w:rFonts w:asciiTheme="majorHAnsi" w:hAnsiTheme="majorHAnsi" w:cstheme="majorHAnsi"/>
-          <w:b/>
-          <w:color w:val="000000"/>
-          <w:sz w:val="26"/>
-          <w:szCs w:val="26"/>
-        </w:rPr>
-        <w:t>Screenshot</w:t>
-      </w:r>
-      <w:r>
-        <w:rPr>
-          <w:rFonts w:asciiTheme="majorHAnsi" w:hAnsiTheme="majorHAnsi" w:cstheme="majorHAnsi"/>
-          <w:b/>
-          <w:sz w:val="26"/>
-          <w:szCs w:val="26"/>
-        </w:rPr>
-        <w:t xml:space="preserve"> </w:t>
-      </w:r>
-      <w:r>
-        <w:rPr>
-          <w:rFonts w:asciiTheme="majorHAnsi" w:hAnsiTheme="majorHAnsi" w:cstheme="majorHAnsi"/>
-          <w:b/>
-          <w:sz w:val="26"/>
-          <w:szCs w:val="26"/>
-          <w:lang w:val="en-US"/>
-        </w:rPr>
-        <w:t>2</w:t>
-      </w:r>
-      <w:r>
-        <w:rPr>
-          <w:rFonts w:asciiTheme="majorHAnsi" w:hAnsiTheme="majorHAnsi" w:cstheme="majorHAnsi"/>
-          <w:b/>
-          <w:sz w:val="26"/>
-          <w:szCs w:val="26"/>
-          <w:lang w:val="en-US"/>
-        </w:rPr>
-        <w:t>:</w:t>
-      </w:r>
-      <w:r>
-        <w:rPr>
-          <w:rFonts w:asciiTheme="majorHAnsi" w:hAnsiTheme="majorHAnsi" w:cstheme="majorHAnsi"/>
-          <w:sz w:val="26"/>
-          <w:szCs w:val="26"/>
-        </w:rPr>
-        <w:t xml:space="preserve"> </w:t>
-      </w:r>
-      <w:r>
-        <w:rPr>
-          <w:rFonts w:asciiTheme="majorHAnsi" w:hAnsiTheme="majorHAnsi" w:cstheme="majorHAnsi"/>
-          <w:color w:val="000000"/>
-          <w:sz w:val="26"/>
-          <w:szCs w:val="26"/>
-        </w:rPr>
-        <w:t xml:space="preserve">Screenshot of MongoDB Compass with database </w:t>
-      </w:r>
-      <w:r>
-        <w:rPr>
-          <w:rFonts w:asciiTheme="majorHAnsi" w:hAnsiTheme="majorHAnsi" w:cstheme="majorHAnsi"/>
-          <w:color w:val="0070C0"/>
-          <w:sz w:val="26"/>
-          <w:szCs w:val="26"/>
-        </w:rPr>
-        <w:t>bug_reports</w:t>
-      </w:r>
-      <w:r>
-        <w:rPr>
-          <w:rFonts w:asciiTheme="majorHAnsi" w:hAnsiTheme="majorHAnsi" w:cstheme="majorHAnsi"/>
-          <w:color w:val="0070C0"/>
-          <w:sz w:val="26"/>
-          <w:szCs w:val="26"/>
-          <w:lang w:val="en-US"/>
-        </w:rPr>
-        <w:t xml:space="preserve"> </w:t>
-      </w:r>
-      <w:r>
-        <w:rPr>
-          <w:rFonts w:asciiTheme="majorHAnsi" w:hAnsiTheme="majorHAnsi" w:cstheme="majorHAnsi"/>
-          <w:sz w:val="26"/>
-          <w:szCs w:val="26"/>
-          <w:lang w:val="en-US"/>
-        </w:rPr>
-        <w:t xml:space="preserve">(has a collection of </w:t>
-      </w:r>
-      <w:r>
-        <w:rPr>
-          <w:rFonts w:asciiTheme="majorHAnsi" w:hAnsiTheme="majorHAnsi" w:cstheme="majorHAnsi"/>
-          <w:color w:val="0070C0"/>
-          <w:sz w:val="26"/>
-          <w:szCs w:val="26"/>
-          <w:lang w:val="en-US"/>
-        </w:rPr>
-        <w:t xml:space="preserve">reports </w:t>
-      </w:r>
-      <w:r>
-        <w:rPr>
-          <w:rFonts w:asciiTheme="majorHAnsi" w:hAnsiTheme="majorHAnsi" w:cstheme="majorHAnsi"/>
-          <w:sz w:val="26"/>
-          <w:szCs w:val="26"/>
-          <w:lang w:val="en-US"/>
-        </w:rPr>
-        <w:t xml:space="preserve">and </w:t>
-      </w:r>
-      <w:r>
-        <w:rPr>
-          <w:rFonts w:asciiTheme="majorHAnsi" w:hAnsiTheme="majorHAnsi" w:cstheme="majorHAnsi"/>
-          <w:color w:val="0070C0"/>
-          <w:sz w:val="26"/>
-          <w:szCs w:val="26"/>
-          <w:lang w:val="en-US"/>
-        </w:rPr>
-        <w:t>users</w:t>
-      </w:r>
-      <w:r>
-        <w:rPr>
-          <w:rFonts w:asciiTheme="majorHAnsi" w:hAnsiTheme="majorHAnsi" w:cstheme="majorHAnsi"/>
-          <w:sz w:val="26"/>
-          <w:szCs w:val="26"/>
-          <w:lang w:val="en-US"/>
-        </w:rPr>
-        <w:t>.)</w:t>
-      </w:r>
-    </w:p>
-    <w:p>
-      <w:pPr>
-        <w:rPr>
-          <w:rFonts w:asciiTheme="majorHAnsi" w:hAnsiTheme="majorHAnsi" w:cstheme="majorHAnsi"/>
-          <w:sz w:val="26"/>
-          <w:szCs w:val="26"/>
-        </w:rPr>
-      </w:pPr>
-    </w:p>
-    <w:p>
-      <w:pPr>
-        <w:jc w:val="center"/>
-        <w:rPr>
-          <w:rFonts w:asciiTheme="majorHAnsi" w:hAnsiTheme="majorHAnsi" w:cstheme="majorHAnsi"/>
-          <w:i/>
-          <w:color w:val="00B050"/>
-          <w:sz w:val="20"/>
-          <w:szCs w:val="20"/>
-          <w:lang w:val="en-US"/>
-        </w:rPr>
-      </w:pPr>
-      <w:r>
-        <w:rPr>
-          <w:rFonts w:asciiTheme="majorHAnsi" w:hAnsiTheme="majorHAnsi" w:cstheme="majorHAnsi"/>
-          <w:i/>
-          <w:color w:val="00B050"/>
-          <w:sz w:val="20"/>
-          <w:szCs w:val="20"/>
-          <w:lang w:val="en-US"/>
-        </w:rPr>
-        <w:t>&lt;Place the image here&gt;</w:t>
-      </w:r>
-    </w:p>
-    <w:p>
-      <w:pPr>
-        <w:rPr>
-          <w:rFonts w:asciiTheme="majorHAnsi" w:hAnsiTheme="majorHAnsi" w:cstheme="majorHAnsi"/>
-          <w:sz w:val="26"/>
-          <w:szCs w:val="26"/>
-        </w:rPr>
-      </w:pPr>
+        <w:drawing>
+          <wp:inline distT="0" distB="0" distL="0" distR="0" wp14:anchorId="50083FB4" wp14:editId="13CDE35D">
+            <wp:extent cx="2705478" cy="809738"/>
+            <wp:effectExtent l="0" t="0" r="0" b="9525"/>
+            <wp:docPr id="2" name="Picture 2"/>
+            <wp:cNvGraphicFramePr>
+              <a:graphicFrameLocks xmlns:a="http://schemas.openxmlformats.org/drawingml/2006/main" noChangeAspect="1"/>
+            </wp:cNvGraphicFramePr>
+            <a:graphic xmlns:a="http://schemas.openxmlformats.org/drawingml/2006/main">
+              <a:graphicData uri="http://schemas.openxmlformats.org/drawingml/2006/picture">
+                <pic:pic xmlns:pic="http://schemas.openxmlformats.org/drawingml/2006/picture">
+                  <pic:nvPicPr>
+                    <pic:cNvPr id="1" name=""/>
+                    <pic:cNvPicPr/>
+                  </pic:nvPicPr>
+                  <pic:blipFill>
+                    <a:blip r:embed="rId8"/>
+                    <a:stretch>
+                      <a:fillRect/>
+                    </a:stretch>
+                  </pic:blipFill>
+                  <pic:spPr>
+                    <a:xfrm>
+                      <a:off x="0" y="0"/>
+                      <a:ext cx="2705478" cy="809738"/>
+                    </a:xfrm>
+                    <a:prstGeom prst="rect">
+                      <a:avLst/>
+                    </a:prstGeom>
+                  </pic:spPr>
+                </pic:pic>
+              </a:graphicData>
+            </a:graphic>
+          </wp:inline>
+        </w:drawing>
+      </w:r>
     </w:p>
     <w:p>
       <w:pPr>
@@ -617,7 +647,7 @@
         </w:rPr>
         <w:t xml:space="preserve">Accessing the homepage </w:t>
       </w:r>
-      <w:hyperlink r:id="rId7" w:history="1">
+      <w:hyperlink r:id="rId9" w:history="1">
         <w:r>
           <w:rPr>
             <w:rStyle w:val="Hyperlink"/>
@@ -698,7 +728,20 @@
           <w:szCs w:val="20"/>
           <w:lang w:val="en-US"/>
         </w:rPr>
-        <w:t>&lt;Place the image here&gt;</w:t>
+        <w:t>&lt;Place the im</w:t>
+      </w:r>
+      <w:bookmarkStart w:id="0" w:name="_GoBack"/>
+      <w:bookmarkEnd w:id="0"/>
+      <w:r>
+        <w:rPr>
+          <w:rFonts w:asciiTheme="majorHAnsi" w:hAnsiTheme="majorHAnsi" w:cstheme="majorHAnsi"/>
+          <w:i/>
+          <w:color w:val="00B050"/>
+          <w:sz w:val="20"/>
+          <w:szCs w:val="20"/>
+          <w:lang w:val="en-US"/>
+        </w:rPr>
+        <w:t>age here&gt;</w:t>
       </w:r>
     </w:p>
     <w:p>
@@ -2428,7 +2471,7 @@
 </file>
 
 <file path=customXml/itemProps1.xml><?xml version="1.0" encoding="utf-8"?>
-<ds:datastoreItem xmlns:ds="http://schemas.openxmlformats.org/officeDocument/2006/customXml" ds:itemID="{B34ECE4A-81E2-4A17-A2EC-94D189729268}">
+<ds:datastoreItem xmlns:ds="http://schemas.openxmlformats.org/officeDocument/2006/customXml" ds:itemID="{407DD37B-F8C0-4919-B71D-89274FA05C26}">
   <ds:schemaRefs>
     <ds:schemaRef ds:uri="http://schemas.openxmlformats.org/officeDocument/2006/bibliography"/>
   </ds:schemaRefs>

</xml_diff>